<commit_message>
feat(docs): publication-grade PDF master technical report, DFD architecture diagram, live screenshots, and BiDi Arabic typography
</commit_message>
<xml_diff>
--- a/docs/Project_Hares_Master_Technical_Report.docx
+++ b/docs/Project_Hares_Master_Technical_Report.docx
@@ -461,6 +461,63 @@
           <w:sz w:val="20"/>
         </w:rPr>
         <w:t>Traditional defenses suffer from two structural failures: (1) manual review queues require 24 to 48 hours while victims click within 15 minutes, and (2) commercial AI triage pipes sensitive citizen communications to offshore APIs, violating national data sovereignty under UAE Federal Decree-Law No. 45 (PDPL).</w:t>
+      </w:r>
+    </w:p>
+    <w:p>
+      <w:pPr>
+        <w:spacing w:before="200" w:after="60"/>
+        <w:jc w:val="center"/>
+      </w:pPr>
+    </w:p>
+    <w:p>
+      <w:r>
+        <w:drawing>
+          <wp:inline xmlns:a="http://schemas.openxmlformats.org/drawingml/2006/main" xmlns:pic="http://schemas.openxmlformats.org/drawingml/2006/picture">
+            <wp:extent cx="5120640" cy="7823200"/>
+            <wp:docPr id="1" name="Picture 1"/>
+            <wp:cNvGraphicFramePr>
+              <a:graphicFrameLocks noChangeAspect="1"/>
+            </wp:cNvGraphicFramePr>
+            <a:graphic>
+              <a:graphicData uri="http://schemas.openxmlformats.org/drawingml/2006/picture">
+                <pic:pic>
+                  <pic:nvPicPr>
+                    <pic:cNvPr id="0" name="screenshot_01_fake_police_fine_sms.png"/>
+                    <pic:cNvPicPr/>
+                  </pic:nvPicPr>
+                  <pic:blipFill>
+                    <a:blip r:embed="rId11"/>
+                    <a:stretch>
+                      <a:fillRect/>
+                    </a:stretch>
+                  </pic:blipFill>
+                  <pic:spPr>
+                    <a:xfrm>
+                      <a:off x="0" y="0"/>
+                      <a:ext cx="5120640" cy="7823200"/>
+                    </a:xfrm>
+                    <a:prstGeom prst="rect"/>
+                  </pic:spPr>
+                </pic:pic>
+              </a:graphicData>
+            </a:graphic>
+          </wp:inline>
+        </w:drawing>
+      </w:r>
+    </w:p>
+    <w:p>
+      <w:pPr>
+        <w:spacing w:after="200"/>
+        <w:jc w:val="center"/>
+      </w:pPr>
+      <w:r>
+        <w:rPr>
+          <w:rFonts w:ascii="Calibri" w:hAnsi="Calibri"/>
+          <w:b/>
+          <w:color w:val="0B1B3D"/>
+          <w:sz w:val="17"/>
+        </w:rPr>
+        <w:t>Figure: Authentic Dubai Smishing Lure: Spoofed Police Legal Fine SMS Intercepted &amp; Classified RED</w:t>
       </w:r>
     </w:p>
     <w:p>
@@ -1026,6 +1083,177 @@
         <w:t>Qwen2.5-3B-Instruct analyzes linguistic coercion, outputs structured JSON, and synthesizes bilingual citizen guidance.</w:t>
       </w:r>
     </w:p>
+    <w:p>
+      <w:pPr>
+        <w:spacing w:before="200" w:after="60"/>
+        <w:jc w:val="center"/>
+      </w:pPr>
+    </w:p>
+    <w:p>
+      <w:r>
+        <w:drawing>
+          <wp:inline xmlns:a="http://schemas.openxmlformats.org/drawingml/2006/main" xmlns:pic="http://schemas.openxmlformats.org/drawingml/2006/picture">
+            <wp:extent cx="5120640" cy="6133083"/>
+            <wp:docPr id="2" name="Picture 2"/>
+            <wp:cNvGraphicFramePr>
+              <a:graphicFrameLocks noChangeAspect="1"/>
+            </wp:cNvGraphicFramePr>
+            <a:graphic>
+              <a:graphicData uri="http://schemas.openxmlformats.org/drawingml/2006/picture">
+                <pic:pic>
+                  <pic:nvPicPr>
+                    <pic:cNvPr id="0" name="dfd new.png"/>
+                    <pic:cNvPicPr/>
+                  </pic:nvPicPr>
+                  <pic:blipFill>
+                    <a:blip r:embed="rId12"/>
+                    <a:stretch>
+                      <a:fillRect/>
+                    </a:stretch>
+                  </pic:blipFill>
+                  <pic:spPr>
+                    <a:xfrm>
+                      <a:off x="0" y="0"/>
+                      <a:ext cx="5120640" cy="6133083"/>
+                    </a:xfrm>
+                    <a:prstGeom prst="rect"/>
+                  </pic:spPr>
+                </pic:pic>
+              </a:graphicData>
+            </a:graphic>
+          </wp:inline>
+        </w:drawing>
+      </w:r>
+    </w:p>
+    <w:p>
+      <w:pPr>
+        <w:spacing w:after="200"/>
+        <w:jc w:val="center"/>
+      </w:pPr>
+      <w:r>
+        <w:rPr>
+          <w:rFonts w:ascii="Calibri" w:hAnsi="Calibri"/>
+          <w:b/>
+          <w:color w:val="0B1B3D"/>
+          <w:sz w:val="17"/>
+        </w:rPr>
+        <w:t>Figure: End-to-End System Architecture &amp; Data Flow Diagram (DFD) — Citizen Ingress, Platform Operations, Triage Processing &amp; Threat Intelligence</w:t>
+      </w:r>
+    </w:p>
+    <w:p>
+      <w:pPr>
+        <w:spacing w:before="200" w:after="60"/>
+        <w:jc w:val="center"/>
+      </w:pPr>
+    </w:p>
+    <w:p>
+      <w:r>
+        <w:drawing>
+          <wp:inline xmlns:a="http://schemas.openxmlformats.org/drawingml/2006/main" xmlns:pic="http://schemas.openxmlformats.org/drawingml/2006/picture">
+            <wp:extent cx="5120640" cy="2857596"/>
+            <wp:docPr id="3" name="Picture 3"/>
+            <wp:cNvGraphicFramePr>
+              <a:graphicFrameLocks noChangeAspect="1"/>
+            </wp:cNvGraphicFramePr>
+            <a:graphic>
+              <a:graphicData uri="http://schemas.openxmlformats.org/drawingml/2006/picture">
+                <pic:pic>
+                  <pic:nvPicPr>
+                    <pic:cNvPr id="0" name="Screenshot 2026-10-15 171158.png"/>
+                    <pic:cNvPicPr/>
+                  </pic:nvPicPr>
+                  <pic:blipFill>
+                    <a:blip r:embed="rId13"/>
+                    <a:stretch>
+                      <a:fillRect/>
+                    </a:stretch>
+                  </pic:blipFill>
+                  <pic:spPr>
+                    <a:xfrm>
+                      <a:off x="0" y="0"/>
+                      <a:ext cx="5120640" cy="2857596"/>
+                    </a:xfrm>
+                    <a:prstGeom prst="rect"/>
+                  </pic:spPr>
+                </pic:pic>
+              </a:graphicData>
+            </a:graphic>
+          </wp:inline>
+        </w:drawing>
+      </w:r>
+    </w:p>
+    <w:p>
+      <w:pPr>
+        <w:spacing w:after="200"/>
+        <w:jc w:val="center"/>
+      </w:pPr>
+      <w:r>
+        <w:rPr>
+          <w:rFonts w:ascii="Calibri" w:hAnsi="Calibri"/>
+          <w:b/>
+          <w:color w:val="0B1B3D"/>
+          <w:sz w:val="17"/>
+        </w:rPr>
+        <w:t>Figure: Live Citizen Portal Verdict: Official RTA Communication Verified Safe (GREEN - 1.0% Risk Score)</w:t>
+      </w:r>
+    </w:p>
+    <w:p>
+      <w:pPr>
+        <w:spacing w:before="200" w:after="60"/>
+        <w:jc w:val="center"/>
+      </w:pPr>
+    </w:p>
+    <w:p>
+      <w:r>
+        <w:drawing>
+          <wp:inline xmlns:a="http://schemas.openxmlformats.org/drawingml/2006/main" xmlns:pic="http://schemas.openxmlformats.org/drawingml/2006/picture">
+            <wp:extent cx="5120640" cy="2401328"/>
+            <wp:docPr id="4" name="Picture 4"/>
+            <wp:cNvGraphicFramePr>
+              <a:graphicFrameLocks noChangeAspect="1"/>
+            </wp:cNvGraphicFramePr>
+            <a:graphic>
+              <a:graphicData uri="http://schemas.openxmlformats.org/drawingml/2006/picture">
+                <pic:pic>
+                  <pic:nvPicPr>
+                    <pic:cNvPr id="0" name="Screenshot 2026-10-15 134344 - Copy.png"/>
+                    <pic:cNvPicPr/>
+                  </pic:nvPicPr>
+                  <pic:blipFill>
+                    <a:blip r:embed="rId14"/>
+                    <a:stretch>
+                      <a:fillRect/>
+                    </a:stretch>
+                  </pic:blipFill>
+                  <pic:spPr>
+                    <a:xfrm>
+                      <a:off x="0" y="0"/>
+                      <a:ext cx="5120640" cy="2401328"/>
+                    </a:xfrm>
+                    <a:prstGeom prst="rect"/>
+                  </pic:spPr>
+                </pic:pic>
+              </a:graphicData>
+            </a:graphic>
+          </wp:inline>
+        </w:drawing>
+      </w:r>
+    </w:p>
+    <w:p>
+      <w:pPr>
+        <w:spacing w:after="200"/>
+        <w:jc w:val="center"/>
+      </w:pPr>
+      <w:r>
+        <w:rPr>
+          <w:rFonts w:ascii="Calibri" w:hAnsi="Calibri"/>
+          <w:b/>
+          <w:color w:val="0B1B3D"/>
+          <w:sz w:val="17"/>
+        </w:rPr>
+        <w:t>Figure: Live Hugging Face ZeroGPU Neural Triage: Central Bank KYC Phishing Lure Intercepted (RED - 98.0% Risk Score with Pydantic JSON Schema)</w:t>
+      </w:r>
+    </w:p>
     <w:tbl>
       <w:tblPr>
         <w:tblW w:type="auto" w:w="0"/>
@@ -1318,7 +1546,7 @@
         <w:drawing>
           <wp:inline xmlns:a="http://schemas.openxmlformats.org/drawingml/2006/main" xmlns:pic="http://schemas.openxmlformats.org/drawingml/2006/picture">
             <wp:extent cx="5120640" cy="4267200"/>
-            <wp:docPr id="1" name="Picture 1"/>
+            <wp:docPr id="5" name="Picture 5"/>
             <wp:cNvGraphicFramePr>
               <a:graphicFrameLocks noChangeAspect="1"/>
             </wp:cNvGraphicFramePr>
@@ -1330,7 +1558,7 @@
                     <pic:cNvPicPr/>
                   </pic:nvPicPr>
                   <pic:blipFill>
-                    <a:blip r:embed="rId11"/>
+                    <a:blip r:embed="rId15"/>
                     <a:stretch>
                       <a:fillRect/>
                     </a:stretch>
@@ -1375,7 +1603,7 @@
         <w:drawing>
           <wp:inline xmlns:a="http://schemas.openxmlformats.org/drawingml/2006/main" xmlns:pic="http://schemas.openxmlformats.org/drawingml/2006/picture">
             <wp:extent cx="5120640" cy="3012141"/>
-            <wp:docPr id="2" name="Picture 2"/>
+            <wp:docPr id="6" name="Picture 6"/>
             <wp:cNvGraphicFramePr>
               <a:graphicFrameLocks noChangeAspect="1"/>
             </wp:cNvGraphicFramePr>
@@ -1387,7 +1615,7 @@
                     <pic:cNvPicPr/>
                   </pic:nvPicPr>
                   <pic:blipFill>
-                    <a:blip r:embed="rId12"/>
+                    <a:blip r:embed="rId16"/>
                     <a:stretch>
                       <a:fillRect/>
                     </a:stretch>
@@ -1432,7 +1660,7 @@
         <w:drawing>
           <wp:inline xmlns:a="http://schemas.openxmlformats.org/drawingml/2006/main" xmlns:pic="http://schemas.openxmlformats.org/drawingml/2006/picture">
             <wp:extent cx="5120640" cy="4267200"/>
-            <wp:docPr id="3" name="Picture 3"/>
+            <wp:docPr id="7" name="Picture 7"/>
             <wp:cNvGraphicFramePr>
               <a:graphicFrameLocks noChangeAspect="1"/>
             </wp:cNvGraphicFramePr>
@@ -1444,7 +1672,7 @@
                     <pic:cNvPicPr/>
                   </pic:nvPicPr>
                   <pic:blipFill>
-                    <a:blip r:embed="rId13"/>
+                    <a:blip r:embed="rId17"/>
                     <a:stretch>
                       <a:fillRect/>
                     </a:stretch>
@@ -1489,7 +1717,7 @@
         <w:drawing>
           <wp:inline xmlns:a="http://schemas.openxmlformats.org/drawingml/2006/main" xmlns:pic="http://schemas.openxmlformats.org/drawingml/2006/picture">
             <wp:extent cx="5120640" cy="2958592"/>
-            <wp:docPr id="4" name="Picture 4"/>
+            <wp:docPr id="8" name="Picture 8"/>
             <wp:cNvGraphicFramePr>
               <a:graphicFrameLocks noChangeAspect="1"/>
             </wp:cNvGraphicFramePr>
@@ -1501,7 +1729,7 @@
                     <pic:cNvPicPr/>
                   </pic:nvPicPr>
                   <pic:blipFill>
-                    <a:blip r:embed="rId14"/>
+                    <a:blip r:embed="rId18"/>
                     <a:stretch>
                       <a:fillRect/>
                     </a:stretch>
@@ -1536,6 +1764,63 @@
       </w:r>
     </w:p>
     <w:p>
+      <w:pPr>
+        <w:spacing w:before="200" w:after="60"/>
+        <w:jc w:val="center"/>
+      </w:pPr>
+    </w:p>
+    <w:p>
+      <w:r>
+        <w:drawing>
+          <wp:inline xmlns:a="http://schemas.openxmlformats.org/drawingml/2006/main" xmlns:pic="http://schemas.openxmlformats.org/drawingml/2006/picture">
+            <wp:extent cx="5120640" cy="3277210"/>
+            <wp:docPr id="9" name="Picture 9"/>
+            <wp:cNvGraphicFramePr>
+              <a:graphicFrameLocks noChangeAspect="1"/>
+            </wp:cNvGraphicFramePr>
+            <a:graphic>
+              <a:graphicData uri="http://schemas.openxmlformats.org/drawingml/2006/picture">
+                <pic:pic>
+                  <pic:nvPicPr>
+                    <pic:cNvPr id="0" name="figure5_conformal_error_bound.png"/>
+                    <pic:cNvPicPr/>
+                  </pic:nvPicPr>
+                  <pic:blipFill>
+                    <a:blip r:embed="rId19"/>
+                    <a:stretch>
+                      <a:fillRect/>
+                    </a:stretch>
+                  </pic:blipFill>
+                  <pic:spPr>
+                    <a:xfrm>
+                      <a:off x="0" y="0"/>
+                      <a:ext cx="5120640" cy="3277210"/>
+                    </a:xfrm>
+                    <a:prstGeom prst="rect"/>
+                  </pic:spPr>
+                </pic:pic>
+              </a:graphicData>
+            </a:graphic>
+          </wp:inline>
+        </w:drawing>
+      </w:r>
+    </w:p>
+    <w:p>
+      <w:pPr>
+        <w:spacing w:after="200"/>
+        <w:jc w:val="center"/>
+      </w:pPr>
+      <w:r>
+        <w:rPr>
+          <w:rFonts w:ascii="Calibri" w:hAnsi="Calibri"/>
+          <w:b/>
+          <w:color w:val="0B1B3D"/>
+          <w:sz w:val="17"/>
+        </w:rPr>
+        <w:t>Figure: Conformal Prediction Statistical Error Bounding Curve (Certified FPR &lt;= 0.1% at 95% Confidence)</w:t>
+      </w:r>
+    </w:p>
+    <w:p>
       <w:r>
         <w:br w:type="page"/>
       </w:r>
@@ -1566,6 +1851,63 @@
           <w:sz w:val="20"/>
         </w:rPr>
         <w:t>For municipal threat analysts, Project Hares provides an internal SOC Operations Center protected by a master administrative passkey gate. The hub integrates 6 specialized forensic workbenches:</w:t>
+      </w:r>
+    </w:p>
+    <w:p>
+      <w:pPr>
+        <w:spacing w:before="200" w:after="60"/>
+        <w:jc w:val="center"/>
+      </w:pPr>
+    </w:p>
+    <w:p>
+      <w:r>
+        <w:drawing>
+          <wp:inline xmlns:a="http://schemas.openxmlformats.org/drawingml/2006/main" xmlns:pic="http://schemas.openxmlformats.org/drawingml/2006/picture">
+            <wp:extent cx="5120640" cy="2885546"/>
+            <wp:docPr id="10" name="Picture 10"/>
+            <wp:cNvGraphicFramePr>
+              <a:graphicFrameLocks noChangeAspect="1"/>
+            </wp:cNvGraphicFramePr>
+            <a:graphic>
+              <a:graphicData uri="http://schemas.openxmlformats.org/drawingml/2006/picture">
+                <pic:pic>
+                  <pic:nvPicPr>
+                    <pic:cNvPr id="0" name="Screenshot 2026-10-15 170836.png"/>
+                    <pic:cNvPicPr/>
+                  </pic:nvPicPr>
+                  <pic:blipFill>
+                    <a:blip r:embed="rId20"/>
+                    <a:stretch>
+                      <a:fillRect/>
+                    </a:stretch>
+                  </pic:blipFill>
+                  <pic:spPr>
+                    <a:xfrm>
+                      <a:off x="0" y="0"/>
+                      <a:ext cx="5120640" cy="2885546"/>
+                    </a:xfrm>
+                    <a:prstGeom prst="rect"/>
+                  </pic:spPr>
+                </pic:pic>
+              </a:graphicData>
+            </a:graphic>
+          </wp:inline>
+        </w:drawing>
+      </w:r>
+    </w:p>
+    <w:p>
+      <w:pPr>
+        <w:spacing w:after="200"/>
+        <w:jc w:val="center"/>
+      </w:pPr>
+      <w:r>
+        <w:rPr>
+          <w:rFonts w:ascii="Calibri" w:hAnsi="Calibri"/>
+          <w:b/>
+          <w:color w:val="0B1B3D"/>
+          <w:sz w:val="17"/>
+        </w:rPr>
+        <w:t>Figure: Live Municipal SOC Hub Telemetry: 24h Threat Arrival Curve, Active Indicators &amp; Top Impersonation Entities</w:t>
       </w:r>
     </w:p>
     <w:p>

</xml_diff>